<commit_message>
Actualizacion de la documentacion del proyecto
</commit_message>
<xml_diff>
--- a/SEGUNDO PARCIAL/ALCANCE DEL PROYECTO 2PARCIAL.docx
+++ b/SEGUNDO PARCIAL/ALCANCE DEL PROYECTO 2PARCIAL.docx
@@ -755,12 +755,241 @@
         <w:t>Reporte general de órdenes atendidas e ingresos generados.</w:t>
       </w:r>
     </w:p>
+    <w:p>
+      <w:pPr>
+        <w:numPr>
+          <w:ilvl w:val="0"/>
+          <w:numId w:val="3"/>
+        </w:numPr>
+        <w:rPr>
+          <w:b/>
+          <w:bCs/>
+        </w:rPr>
+      </w:pPr>
+      <w:r>
+        <w:rPr>
+          <w:b/>
+          <w:bCs/>
+        </w:rPr>
+        <w:t>Módulo</w:t>
+      </w:r>
+      <w:r>
+        <w:rPr>
+          <w:b/>
+          <w:bCs/>
+        </w:rPr>
+        <w:t xml:space="preserve"> de Control</w:t>
+      </w:r>
+      <w:r>
+        <w:rPr>
+          <w:b/>
+          <w:bCs/>
+        </w:rPr>
+        <w:t xml:space="preserve"> de Acceso por Roles (RBAC)</w:t>
+      </w:r>
+    </w:p>
+    <w:p>
+      <w:pPr>
+        <w:pStyle w:val="NormalWeb"/>
+        <w:numPr>
+          <w:ilvl w:val="1"/>
+          <w:numId w:val="3"/>
+        </w:numPr>
+      </w:pPr>
+      <w:r>
+        <w:rPr>
+          <w:rStyle w:val="Fuerte"/>
+        </w:rPr>
+        <w:t xml:space="preserve">Enrutador Protegido en </w:t>
+      </w:r>
+      <w:proofErr w:type="spellStart"/>
+      <w:r>
+        <w:rPr>
+          <w:rStyle w:val="Fuerte"/>
+        </w:rPr>
+        <w:t>Frontend</w:t>
+      </w:r>
+      <w:proofErr w:type="spellEnd"/>
+      <w:r>
+        <w:rPr>
+          <w:rStyle w:val="Fuerte"/>
+        </w:rPr>
+        <w:t>:</w:t>
+      </w:r>
+      <w:r>
+        <w:t xml:space="preserve"> Implementación de rutas privadas en React </w:t>
+      </w:r>
+      <w:proofErr w:type="spellStart"/>
+      <w:r>
+        <w:t>Router</w:t>
+      </w:r>
+      <w:proofErr w:type="spellEnd"/>
+      <w:r>
+        <w:t xml:space="preserve"> que verifiquen el rol del usuario contenido en el token JWT.</w:t>
+      </w:r>
+    </w:p>
+    <w:p>
+      <w:pPr>
+        <w:pStyle w:val="NormalWeb"/>
+        <w:numPr>
+          <w:ilvl w:val="1"/>
+          <w:numId w:val="3"/>
+        </w:numPr>
+      </w:pPr>
+      <w:proofErr w:type="spellStart"/>
+      <w:r>
+        <w:rPr>
+          <w:rStyle w:val="Fuerte"/>
+        </w:rPr>
+        <w:t>Dashboard</w:t>
+      </w:r>
+      <w:proofErr w:type="spellEnd"/>
+      <w:r>
+        <w:rPr>
+          <w:rStyle w:val="Fuerte"/>
+        </w:rPr>
+        <w:t xml:space="preserve"> del Administrador (</w:t>
+      </w:r>
+      <w:r>
+        <w:rPr>
+          <w:rStyle w:val="CdigoHTML"/>
+          <w:rFonts w:ascii="Times New Roman" w:hAnsi="Times New Roman" w:cs="Times New Roman"/>
+          <w:sz w:val="24"/>
+          <w:szCs w:val="24"/>
+        </w:rPr>
+        <w:t>/</w:t>
+      </w:r>
+      <w:proofErr w:type="spellStart"/>
+      <w:r>
+        <w:rPr>
+          <w:rStyle w:val="CdigoHTML"/>
+          <w:rFonts w:ascii="Times New Roman" w:hAnsi="Times New Roman" w:cs="Times New Roman"/>
+          <w:sz w:val="24"/>
+          <w:szCs w:val="24"/>
+        </w:rPr>
+        <w:t>dashboard</w:t>
+      </w:r>
+      <w:proofErr w:type="spellEnd"/>
+      <w:r>
+        <w:rPr>
+          <w:rStyle w:val="Fuerte"/>
+        </w:rPr>
+        <w:t>):</w:t>
+      </w:r>
+      <w:r>
+        <w:t xml:space="preserve"> Menú lateral completo con acceso global a Clientes, Vehículos, Catálogo, Órdenes Generales e informes financieros.</w:t>
+      </w:r>
+    </w:p>
+    <w:p>
+      <w:pPr>
+        <w:pStyle w:val="NormalWeb"/>
+        <w:numPr>
+          <w:ilvl w:val="1"/>
+          <w:numId w:val="3"/>
+        </w:numPr>
+      </w:pPr>
+      <w:proofErr w:type="spellStart"/>
+      <w:r>
+        <w:rPr>
+          <w:rStyle w:val="Fuerte"/>
+        </w:rPr>
+        <w:t>Dashboard</w:t>
+      </w:r>
+      <w:proofErr w:type="spellEnd"/>
+      <w:r>
+        <w:rPr>
+          <w:rStyle w:val="Fuerte"/>
+        </w:rPr>
+        <w:t xml:space="preserve"> del Técnico (</w:t>
+      </w:r>
+      <w:r>
+        <w:rPr>
+          <w:rStyle w:val="CdigoHTML"/>
+          <w:rFonts w:ascii="Times New Roman" w:hAnsi="Times New Roman" w:cs="Times New Roman"/>
+          <w:sz w:val="24"/>
+          <w:szCs w:val="24"/>
+        </w:rPr>
+        <w:t>/</w:t>
+      </w:r>
+      <w:proofErr w:type="spellStart"/>
+      <w:r>
+        <w:rPr>
+          <w:rStyle w:val="CdigoHTML"/>
+          <w:rFonts w:ascii="Times New Roman" w:hAnsi="Times New Roman" w:cs="Times New Roman"/>
+          <w:sz w:val="24"/>
+          <w:szCs w:val="24"/>
+        </w:rPr>
+        <w:t>tecnico</w:t>
+      </w:r>
+      <w:proofErr w:type="spellEnd"/>
+      <w:r>
+        <w:rPr>
+          <w:rStyle w:val="CdigoHTML"/>
+          <w:rFonts w:ascii="Times New Roman" w:hAnsi="Times New Roman" w:cs="Times New Roman"/>
+          <w:sz w:val="24"/>
+          <w:szCs w:val="24"/>
+        </w:rPr>
+        <w:t>/</w:t>
+      </w:r>
+      <w:proofErr w:type="spellStart"/>
+      <w:r>
+        <w:rPr>
+          <w:rStyle w:val="CdigoHTML"/>
+          <w:rFonts w:ascii="Times New Roman" w:hAnsi="Times New Roman" w:cs="Times New Roman"/>
+          <w:sz w:val="24"/>
+          <w:szCs w:val="24"/>
+        </w:rPr>
+        <w:t>dashboard</w:t>
+      </w:r>
+      <w:proofErr w:type="spellEnd"/>
+      <w:r>
+        <w:rPr>
+          <w:rStyle w:val="Fuerte"/>
+        </w:rPr>
+        <w:t>):</w:t>
+      </w:r>
+      <w:r>
+        <w:t xml:space="preserve"> Interfaz móvil/</w:t>
+      </w:r>
+      <w:proofErr w:type="spellStart"/>
+      <w:r>
+        <w:t>tablet</w:t>
+      </w:r>
+      <w:proofErr w:type="spellEnd"/>
+      <w:r>
+        <w:t xml:space="preserve"> simplificada y optimizada. Muestra únicamente la lista de vehículos y órdenes que tiene asignadas el mecánico </w:t>
+      </w:r>
+      <w:proofErr w:type="spellStart"/>
+      <w:r>
+        <w:t>logueado</w:t>
+      </w:r>
+      <w:proofErr w:type="spellEnd"/>
+      <w:r>
+        <w:t>, ocultando accesos administrativos.</w:t>
+      </w:r>
+    </w:p>
     <w:p/>
+    <w:p/>
+    <w:p>
+      <w:pPr>
+        <w:spacing w:line="240" w:lineRule="auto"/>
+        <w:rPr>
+          <w:rFonts w:eastAsiaTheme="majorEastAsia" w:cstheme="majorBidi"/>
+          <w:b/>
+          <w:color w:val="000000" w:themeColor="text1"/>
+          <w:szCs w:val="26"/>
+        </w:rPr>
+      </w:pPr>
+      <w:r>
+        <w:br w:type="page"/>
+      </w:r>
+    </w:p>
     <w:p>
       <w:pPr>
         <w:pStyle w:val="Ttulo2"/>
       </w:pPr>
       <w:r>
+        <w:lastRenderedPageBreak/>
         <w:t>Organización del Equipo</w:t>
       </w:r>
     </w:p>
@@ -1714,6 +1943,155 @@
       </w:rPr>
     </w:lvl>
   </w:abstractNum>
+  <w:abstractNum w:abstractNumId="3" w15:restartNumberingAfterBreak="0">
+    <w:nsid w:val="7BA30249"/>
+    <w:multiLevelType w:val="multilevel"/>
+    <w:tmpl w:val="D566293C"/>
+    <w:lvl w:ilvl="0">
+      <w:start w:val="1"/>
+      <w:numFmt w:val="bullet"/>
+      <w:lvlText w:val=""/>
+      <w:lvlJc w:val="left"/>
+      <w:pPr>
+        <w:tabs>
+          <w:tab w:val="num" w:pos="720"/>
+        </w:tabs>
+        <w:ind w:left="720" w:hanging="360"/>
+      </w:pPr>
+      <w:rPr>
+        <w:rFonts w:ascii="Symbol" w:hAnsi="Symbol" w:hint="default"/>
+        <w:sz w:val="20"/>
+      </w:rPr>
+    </w:lvl>
+    <w:lvl w:ilvl="1" w:tentative="1">
+      <w:start w:val="1"/>
+      <w:numFmt w:val="bullet"/>
+      <w:lvlText w:val="o"/>
+      <w:lvlJc w:val="left"/>
+      <w:pPr>
+        <w:tabs>
+          <w:tab w:val="num" w:pos="1440"/>
+        </w:tabs>
+        <w:ind w:left="1440" w:hanging="360"/>
+      </w:pPr>
+      <w:rPr>
+        <w:rFonts w:ascii="Courier New" w:hAnsi="Courier New" w:hint="default"/>
+        <w:sz w:val="20"/>
+      </w:rPr>
+    </w:lvl>
+    <w:lvl w:ilvl="2" w:tentative="1">
+      <w:start w:val="1"/>
+      <w:numFmt w:val="bullet"/>
+      <w:lvlText w:val=""/>
+      <w:lvlJc w:val="left"/>
+      <w:pPr>
+        <w:tabs>
+          <w:tab w:val="num" w:pos="2160"/>
+        </w:tabs>
+        <w:ind w:left="2160" w:hanging="360"/>
+      </w:pPr>
+      <w:rPr>
+        <w:rFonts w:ascii="Wingdings" w:hAnsi="Wingdings" w:hint="default"/>
+        <w:sz w:val="20"/>
+      </w:rPr>
+    </w:lvl>
+    <w:lvl w:ilvl="3" w:tentative="1">
+      <w:start w:val="1"/>
+      <w:numFmt w:val="bullet"/>
+      <w:lvlText w:val=""/>
+      <w:lvlJc w:val="left"/>
+      <w:pPr>
+        <w:tabs>
+          <w:tab w:val="num" w:pos="2880"/>
+        </w:tabs>
+        <w:ind w:left="2880" w:hanging="360"/>
+      </w:pPr>
+      <w:rPr>
+        <w:rFonts w:ascii="Wingdings" w:hAnsi="Wingdings" w:hint="default"/>
+        <w:sz w:val="20"/>
+      </w:rPr>
+    </w:lvl>
+    <w:lvl w:ilvl="4" w:tentative="1">
+      <w:start w:val="1"/>
+      <w:numFmt w:val="bullet"/>
+      <w:lvlText w:val=""/>
+      <w:lvlJc w:val="left"/>
+      <w:pPr>
+        <w:tabs>
+          <w:tab w:val="num" w:pos="3600"/>
+        </w:tabs>
+        <w:ind w:left="3600" w:hanging="360"/>
+      </w:pPr>
+      <w:rPr>
+        <w:rFonts w:ascii="Wingdings" w:hAnsi="Wingdings" w:hint="default"/>
+        <w:sz w:val="20"/>
+      </w:rPr>
+    </w:lvl>
+    <w:lvl w:ilvl="5" w:tentative="1">
+      <w:start w:val="1"/>
+      <w:numFmt w:val="bullet"/>
+      <w:lvlText w:val=""/>
+      <w:lvlJc w:val="left"/>
+      <w:pPr>
+        <w:tabs>
+          <w:tab w:val="num" w:pos="4320"/>
+        </w:tabs>
+        <w:ind w:left="4320" w:hanging="360"/>
+      </w:pPr>
+      <w:rPr>
+        <w:rFonts w:ascii="Wingdings" w:hAnsi="Wingdings" w:hint="default"/>
+        <w:sz w:val="20"/>
+      </w:rPr>
+    </w:lvl>
+    <w:lvl w:ilvl="6" w:tentative="1">
+      <w:start w:val="1"/>
+      <w:numFmt w:val="bullet"/>
+      <w:lvlText w:val=""/>
+      <w:lvlJc w:val="left"/>
+      <w:pPr>
+        <w:tabs>
+          <w:tab w:val="num" w:pos="5040"/>
+        </w:tabs>
+        <w:ind w:left="5040" w:hanging="360"/>
+      </w:pPr>
+      <w:rPr>
+        <w:rFonts w:ascii="Wingdings" w:hAnsi="Wingdings" w:hint="default"/>
+        <w:sz w:val="20"/>
+      </w:rPr>
+    </w:lvl>
+    <w:lvl w:ilvl="7" w:tentative="1">
+      <w:start w:val="1"/>
+      <w:numFmt w:val="bullet"/>
+      <w:lvlText w:val=""/>
+      <w:lvlJc w:val="left"/>
+      <w:pPr>
+        <w:tabs>
+          <w:tab w:val="num" w:pos="5760"/>
+        </w:tabs>
+        <w:ind w:left="5760" w:hanging="360"/>
+      </w:pPr>
+      <w:rPr>
+        <w:rFonts w:ascii="Wingdings" w:hAnsi="Wingdings" w:hint="default"/>
+        <w:sz w:val="20"/>
+      </w:rPr>
+    </w:lvl>
+    <w:lvl w:ilvl="8" w:tentative="1">
+      <w:start w:val="1"/>
+      <w:numFmt w:val="bullet"/>
+      <w:lvlText w:val=""/>
+      <w:lvlJc w:val="left"/>
+      <w:pPr>
+        <w:tabs>
+          <w:tab w:val="num" w:pos="6480"/>
+        </w:tabs>
+        <w:ind w:left="6480" w:hanging="360"/>
+      </w:pPr>
+      <w:rPr>
+        <w:rFonts w:ascii="Wingdings" w:hAnsi="Wingdings" w:hint="default"/>
+        <w:sz w:val="20"/>
+      </w:rPr>
+    </w:lvl>
+  </w:abstractNum>
   <w:num w:numId="1" w16cid:durableId="339043234">
     <w:abstractNumId w:val="2"/>
   </w:num>
@@ -1722,6 +2100,9 @@
   </w:num>
   <w:num w:numId="3" w16cid:durableId="1389114034">
     <w:abstractNumId w:val="0"/>
+  </w:num>
+  <w:num w:numId="4" w16cid:durableId="616522380">
+    <w:abstractNumId w:val="3"/>
   </w:num>
 </w:numbering>
 </file>
@@ -2333,6 +2714,7 @@
   <w:style w:type="character" w:default="1" w:styleId="Fuentedeprrafopredeter">
     <w:name w:val="Default Paragraph Font"/>
     <w:uiPriority w:val="1"/>
+    <w:semiHidden/>
     <w:unhideWhenUsed/>
   </w:style>
   <w:style w:type="table" w:default="1" w:styleId="Tablanormal">
@@ -3603,6 +3985,23 @@
       <w:rFonts w:ascii="Courier New" w:eastAsia="Times New Roman" w:hAnsi="Courier New" w:cs="Courier New"/>
       <w:sz w:val="20"/>
       <w:szCs w:val="20"/>
+    </w:rPr>
+  </w:style>
+  <w:style w:type="paragraph" w:styleId="NormalWeb">
+    <w:name w:val="Normal (Web)"/>
+    <w:basedOn w:val="Normal"/>
+    <w:uiPriority w:val="99"/>
+    <w:semiHidden/>
+    <w:unhideWhenUsed/>
+    <w:rsid w:val="00952F6A"/>
+    <w:pPr>
+      <w:spacing w:before="100" w:beforeAutospacing="1" w:after="100" w:afterAutospacing="1" w:line="240" w:lineRule="auto"/>
+    </w:pPr>
+    <w:rPr>
+      <w:rFonts w:eastAsia="Times New Roman" w:cs="Times New Roman"/>
+      <w:kern w:val="0"/>
+      <w:lang w:eastAsia="es-EC"/>
+      <w14:ligatures w14:val="none"/>
     </w:rPr>
   </w:style>
 </w:styles>

</xml_diff>